<commit_message>
feat: add financial reports dashboard and configure pdfkit tracing for report generation
</commit_message>
<xml_diff>
--- a/docs/São João do Ivai/GUIA_PASSO_A_PASSO_TESTES_E_APRESENTACAO_POC_SAO_JOAO_DO_IVAI.docx
+++ b/docs/São João do Ivai/GUIA_PASSO_A_PASSO_TESTES_E_APRESENTACAO_POC_SAO_JOAO_DO_IVAI.docx
@@ -52,12 +52,6 @@
         <w:gridCol w:w="8991"/>
       </w:tblGrid>
       <w:tr>
-        <w:tblPrEx>
-          <w:tblCellMar>
-            <w:top w:w="0" w:type="dxa"/>
-            <w:bottom w:w="0" w:type="dxa"/>
-          </w:tblCellMar>
-        </w:tblPrEx>
         <w:tc>
           <w:tcPr>
             <w:tcW w:w="0" w:type="auto"/>
@@ -301,12 +295,6 @@
         <w:gridCol w:w="3249"/>
       </w:tblGrid>
       <w:tr>
-        <w:tblPrEx>
-          <w:tblCellMar>
-            <w:top w:w="0" w:type="dxa"/>
-            <w:bottom w:w="0" w:type="dxa"/>
-          </w:tblCellMar>
-        </w:tblPrEx>
         <w:tc>
           <w:tcPr>
             <w:tcW w:w="1400" w:type="pct"/>
@@ -396,12 +384,6 @@
         </w:tc>
       </w:tr>
       <w:tr>
-        <w:tblPrEx>
-          <w:tblCellMar>
-            <w:top w:w="0" w:type="dxa"/>
-            <w:bottom w:w="0" w:type="dxa"/>
-          </w:tblCellMar>
-        </w:tblPrEx>
         <w:tc>
           <w:tcPr>
             <w:tcW w:w="1400" w:type="pct"/>
@@ -486,12 +468,6 @@
         </w:tc>
       </w:tr>
       <w:tr>
-        <w:tblPrEx>
-          <w:tblCellMar>
-            <w:top w:w="0" w:type="dxa"/>
-            <w:bottom w:w="0" w:type="dxa"/>
-          </w:tblCellMar>
-        </w:tblPrEx>
         <w:tc>
           <w:tcPr>
             <w:tcW w:w="1400" w:type="pct"/>
@@ -576,12 +552,6 @@
         </w:tc>
       </w:tr>
       <w:tr>
-        <w:tblPrEx>
-          <w:tblCellMar>
-            <w:top w:w="0" w:type="dxa"/>
-            <w:bottom w:w="0" w:type="dxa"/>
-          </w:tblCellMar>
-        </w:tblPrEx>
         <w:tc>
           <w:tcPr>
             <w:tcW w:w="1400" w:type="pct"/>
@@ -709,12 +679,6 @@
         <w:gridCol w:w="2390"/>
       </w:tblGrid>
       <w:tr>
-        <w:tblPrEx>
-          <w:tblCellMar>
-            <w:top w:w="0" w:type="dxa"/>
-            <w:bottom w:w="0" w:type="dxa"/>
-          </w:tblCellMar>
-        </w:tblPrEx>
         <w:tc>
           <w:tcPr>
             <w:tcW w:w="1400" w:type="pct"/>
@@ -833,12 +797,6 @@
         </w:tc>
       </w:tr>
       <w:tr>
-        <w:tblPrEx>
-          <w:tblCellMar>
-            <w:top w:w="0" w:type="dxa"/>
-            <w:bottom w:w="0" w:type="dxa"/>
-          </w:tblCellMar>
-        </w:tblPrEx>
         <w:tc>
           <w:tcPr>
             <w:tcW w:w="1400" w:type="pct"/>
@@ -949,12 +907,6 @@
         </w:tc>
       </w:tr>
       <w:tr>
-        <w:tblPrEx>
-          <w:tblCellMar>
-            <w:top w:w="0" w:type="dxa"/>
-            <w:bottom w:w="0" w:type="dxa"/>
-          </w:tblCellMar>
-        </w:tblPrEx>
         <w:tc>
           <w:tcPr>
             <w:tcW w:w="1400" w:type="pct"/>
@@ -1065,12 +1017,6 @@
         </w:tc>
       </w:tr>
       <w:tr>
-        <w:tblPrEx>
-          <w:tblCellMar>
-            <w:top w:w="0" w:type="dxa"/>
-            <w:bottom w:w="0" w:type="dxa"/>
-          </w:tblCellMar>
-        </w:tblPrEx>
         <w:tc>
           <w:tcPr>
             <w:tcW w:w="1400" w:type="pct"/>
@@ -1181,12 +1127,6 @@
         </w:tc>
       </w:tr>
       <w:tr>
-        <w:tblPrEx>
-          <w:tblCellMar>
-            <w:top w:w="0" w:type="dxa"/>
-            <w:bottom w:w="0" w:type="dxa"/>
-          </w:tblCellMar>
-        </w:tblPrEx>
         <w:tc>
           <w:tcPr>
             <w:tcW w:w="1400" w:type="pct"/>
@@ -1297,12 +1237,6 @@
         </w:tc>
       </w:tr>
       <w:tr>
-        <w:tblPrEx>
-          <w:tblCellMar>
-            <w:top w:w="0" w:type="dxa"/>
-            <w:bottom w:w="0" w:type="dxa"/>
-          </w:tblCellMar>
-        </w:tblPrEx>
         <w:tc>
           <w:tcPr>
             <w:tcW w:w="1400" w:type="pct"/>
@@ -1414,12 +1348,6 @@
         </w:tc>
       </w:tr>
       <w:tr>
-        <w:tblPrEx>
-          <w:tblCellMar>
-            <w:top w:w="0" w:type="dxa"/>
-            <w:bottom w:w="0" w:type="dxa"/>
-          </w:tblCellMar>
-        </w:tblPrEx>
         <w:tc>
           <w:tcPr>
             <w:tcW w:w="1400" w:type="pct"/>
@@ -1784,12 +1712,6 @@
         <w:gridCol w:w="8991"/>
       </w:tblGrid>
       <w:tr>
-        <w:tblPrEx>
-          <w:tblCellMar>
-            <w:top w:w="0" w:type="dxa"/>
-            <w:bottom w:w="0" w:type="dxa"/>
-          </w:tblCellMar>
-        </w:tblPrEx>
         <w:tc>
           <w:tcPr>
             <w:tcW w:w="0" w:type="auto"/>
@@ -2050,12 +1972,6 @@
         <w:gridCol w:w="8991"/>
       </w:tblGrid>
       <w:tr>
-        <w:tblPrEx>
-          <w:tblCellMar>
-            <w:top w:w="0" w:type="dxa"/>
-            <w:bottom w:w="0" w:type="dxa"/>
-          </w:tblCellMar>
-        </w:tblPrEx>
         <w:tc>
           <w:tcPr>
             <w:tcW w:w="0" w:type="auto"/>
@@ -2309,12 +2225,6 @@
         <w:gridCol w:w="8991"/>
       </w:tblGrid>
       <w:tr>
-        <w:tblPrEx>
-          <w:tblCellMar>
-            <w:top w:w="0" w:type="dxa"/>
-            <w:bottom w:w="0" w:type="dxa"/>
-          </w:tblCellMar>
-        </w:tblPrEx>
         <w:tc>
           <w:tcPr>
             <w:tcW w:w="0" w:type="auto"/>
@@ -2722,12 +2632,6 @@
         <w:gridCol w:w="8991"/>
       </w:tblGrid>
       <w:tr>
-        <w:tblPrEx>
-          <w:tblCellMar>
-            <w:top w:w="0" w:type="dxa"/>
-            <w:bottom w:w="0" w:type="dxa"/>
-          </w:tblCellMar>
-        </w:tblPrEx>
         <w:tc>
           <w:tcPr>
             <w:tcW w:w="0" w:type="auto"/>
@@ -3055,12 +2959,6 @@
         <w:gridCol w:w="8991"/>
       </w:tblGrid>
       <w:tr>
-        <w:tblPrEx>
-          <w:tblCellMar>
-            <w:top w:w="0" w:type="dxa"/>
-            <w:bottom w:w="0" w:type="dxa"/>
-          </w:tblCellMar>
-        </w:tblPrEx>
         <w:tc>
           <w:tcPr>
             <w:tcW w:w="0" w:type="auto"/>
@@ -3413,12 +3311,6 @@
         <w:gridCol w:w="8991"/>
       </w:tblGrid>
       <w:tr>
-        <w:tblPrEx>
-          <w:tblCellMar>
-            <w:top w:w="0" w:type="dxa"/>
-            <w:bottom w:w="0" w:type="dxa"/>
-          </w:tblCellMar>
-        </w:tblPrEx>
         <w:tc>
           <w:tcPr>
             <w:tcW w:w="0" w:type="auto"/>
@@ -3694,12 +3586,6 @@
         <w:gridCol w:w="8991"/>
       </w:tblGrid>
       <w:tr>
-        <w:tblPrEx>
-          <w:tblCellMar>
-            <w:top w:w="0" w:type="dxa"/>
-            <w:bottom w:w="0" w:type="dxa"/>
-          </w:tblCellMar>
-        </w:tblPrEx>
         <w:tc>
           <w:tcPr>
             <w:tcW w:w="0" w:type="auto"/>
@@ -4161,12 +4047,6 @@
         <w:gridCol w:w="8991"/>
       </w:tblGrid>
       <w:tr>
-        <w:tblPrEx>
-          <w:tblCellMar>
-            <w:top w:w="0" w:type="dxa"/>
-            <w:bottom w:w="0" w:type="dxa"/>
-          </w:tblCellMar>
-        </w:tblPrEx>
         <w:tc>
           <w:tcPr>
             <w:tcW w:w="0" w:type="auto"/>
@@ -4478,12 +4358,82 @@
       </w:r>
       <w:proofErr w:type="spellEnd"/>
       <w:r>
-        <w:t xml:space="preserve"> possui adaptadores nativos para APIs bancárias oficiais (Banco do Brasil, Caixa, Itaú, Bradesco, Santander), VAN bancária CNAB 240/400 e arquivos OFX padrão FEBRABAN, operando com chaves de integração municipais fornecidas no pós-contratação.</w:t>
+        <w:t xml:space="preserve"> possui adaptadores nativos para APIs bancárias oficiais (Banco do Brasil, Caixa, Itaú, Bradesco, Santander), VAN bancária CNAB 240/400 e arquivos OFX padrão FEBRABAN, operando com chaves de integração municipais fornecidas no pós-contratação</w:t>
+      </w:r>
+    </w:p>
+    <w:p>
+      <w:pPr>
+        <w:pStyle w:val="PargrafodaLista"/>
+        <w:numPr>
+          <w:ilvl w:val="0"/>
+          <w:numId w:val="1"/>
+        </w:numPr>
+        <w:spacing w:before="40" w:after="40"/>
+      </w:pPr>
+    </w:p>
+    <w:p>
+      <w:pPr>
+        <w:pStyle w:val="PargrafodaLista"/>
+        <w:numPr>
+          <w:ilvl w:val="0"/>
+          <w:numId w:val="1"/>
+        </w:numPr>
+        <w:spacing w:before="40" w:after="40"/>
+      </w:pPr>
+    </w:p>
+    <w:p>
+      <w:pPr>
+        <w:pStyle w:val="PargrafodaLista"/>
+        <w:numPr>
+          <w:ilvl w:val="0"/>
+          <w:numId w:val="1"/>
+        </w:numPr>
+        <w:spacing w:before="40" w:after="40"/>
+      </w:pPr>
+      <w:r>
+        <w:drawing>
+          <wp:inline distT="0" distB="0" distL="0" distR="0" wp14:anchorId="2C31CC54" wp14:editId="0D788EE8">
+            <wp:extent cx="4077053" cy="1280271"/>
+            <wp:effectExtent l="0" t="0" r="0" b="0"/>
+            <wp:docPr id="415795870" name="Imagem 1"/>
+            <wp:cNvGraphicFramePr>
+              <a:graphicFrameLocks xmlns:a="http://schemas.openxmlformats.org/drawingml/2006/main" noChangeAspect="1"/>
+            </wp:cNvGraphicFramePr>
+            <a:graphic xmlns:a="http://schemas.openxmlformats.org/drawingml/2006/main">
+              <a:graphicData uri="http://schemas.openxmlformats.org/drawingml/2006/picture">
+                <pic:pic xmlns:pic="http://schemas.openxmlformats.org/drawingml/2006/picture">
+                  <pic:nvPicPr>
+                    <pic:cNvPr id="415795870" name=""/>
+                    <pic:cNvPicPr/>
+                  </pic:nvPicPr>
+                  <pic:blipFill>
+                    <a:blip r:embed="rId7"/>
+                    <a:stretch>
+                      <a:fillRect/>
+                    </a:stretch>
+                  </pic:blipFill>
+                  <pic:spPr>
+                    <a:xfrm>
+                      <a:off x="0" y="0"/>
+                      <a:ext cx="4077053" cy="1280271"/>
+                    </a:xfrm>
+                    <a:prstGeom prst="rect">
+                      <a:avLst/>
+                    </a:prstGeom>
+                  </pic:spPr>
+                </pic:pic>
+              </a:graphicData>
+            </a:graphic>
+          </wp:inline>
+        </w:drawing>
+      </w:r>
+      <w:r>
+        <w:t>.</w:t>
       </w:r>
     </w:p>
     <w:sectPr>
-      <w:headerReference w:type="default" r:id="rId7"/>
-      <w:footerReference w:type="default" r:id="rId8"/>
+      <w:headerReference w:type="default" r:id="rId8"/>
+      <w:footerReference w:type="default" r:id="rId9"/>
       <w:pgSz w:w="11906" w:h="16838"/>
       <w:pgMar w:top="1440" w:right="1440" w:bottom="1440" w:left="1440" w:header="708" w:footer="708" w:gutter="0"/>
       <w:cols w:space="720"/>

</xml_diff>

<commit_message>
feat: add platform blob storage integration and financial document GED management system
</commit_message>
<xml_diff>
--- a/docs/São João do Ivai/GUIA_PASSO_A_PASSO_TESTES_E_APRESENTACAO_POC_SAO_JOAO_DO_IVAI.docx
+++ b/docs/São João do Ivai/GUIA_PASSO_A_PASSO_TESTES_E_APRESENTACAO_POC_SAO_JOAO_DO_IVAI.docx
@@ -4364,76 +4364,13 @@
     <w:p>
       <w:pPr>
         <w:pStyle w:val="PargrafodaLista"/>
-        <w:numPr>
-          <w:ilvl w:val="0"/>
-          <w:numId w:val="1"/>
-        </w:numPr>
         <w:spacing w:before="40" w:after="40"/>
-      </w:pPr>
-    </w:p>
-    <w:p>
-      <w:pPr>
-        <w:pStyle w:val="PargrafodaLista"/>
-        <w:numPr>
-          <w:ilvl w:val="0"/>
-          <w:numId w:val="1"/>
-        </w:numPr>
-        <w:spacing w:before="40" w:after="40"/>
-      </w:pPr>
-    </w:p>
-    <w:p>
-      <w:pPr>
-        <w:pStyle w:val="PargrafodaLista"/>
-        <w:numPr>
-          <w:ilvl w:val="0"/>
-          <w:numId w:val="1"/>
-        </w:numPr>
-        <w:spacing w:before="40" w:after="40"/>
-      </w:pPr>
-      <w:r>
-        <w:drawing>
-          <wp:inline distT="0" distB="0" distL="0" distR="0" wp14:anchorId="2C31CC54" wp14:editId="0D788EE8">
-            <wp:extent cx="4077053" cy="1280271"/>
-            <wp:effectExtent l="0" t="0" r="0" b="0"/>
-            <wp:docPr id="415795870" name="Imagem 1"/>
-            <wp:cNvGraphicFramePr>
-              <a:graphicFrameLocks xmlns:a="http://schemas.openxmlformats.org/drawingml/2006/main" noChangeAspect="1"/>
-            </wp:cNvGraphicFramePr>
-            <a:graphic xmlns:a="http://schemas.openxmlformats.org/drawingml/2006/main">
-              <a:graphicData uri="http://schemas.openxmlformats.org/drawingml/2006/picture">
-                <pic:pic xmlns:pic="http://schemas.openxmlformats.org/drawingml/2006/picture">
-                  <pic:nvPicPr>
-                    <pic:cNvPr id="415795870" name=""/>
-                    <pic:cNvPicPr/>
-                  </pic:nvPicPr>
-                  <pic:blipFill>
-                    <a:blip r:embed="rId7"/>
-                    <a:stretch>
-                      <a:fillRect/>
-                    </a:stretch>
-                  </pic:blipFill>
-                  <pic:spPr>
-                    <a:xfrm>
-                      <a:off x="0" y="0"/>
-                      <a:ext cx="4077053" cy="1280271"/>
-                    </a:xfrm>
-                    <a:prstGeom prst="rect">
-                      <a:avLst/>
-                    </a:prstGeom>
-                  </pic:spPr>
-                </pic:pic>
-              </a:graphicData>
-            </a:graphic>
-          </wp:inline>
-        </w:drawing>
-      </w:r>
-      <w:r>
-        <w:t>.</w:t>
-      </w:r>
+        <w:ind w:left="720"/>
+      </w:pPr>
     </w:p>
     <w:sectPr>
-      <w:headerReference w:type="default" r:id="rId8"/>
-      <w:footerReference w:type="default" r:id="rId9"/>
+      <w:headerReference w:type="default" r:id="rId7"/>
+      <w:footerReference w:type="default" r:id="rId8"/>
       <w:pgSz w:w="11906" w:h="16838"/>
       <w:pgMar w:top="1440" w:right="1440" w:bottom="1440" w:left="1440" w:header="708" w:footer="708" w:gutter="0"/>
       <w:cols w:space="720"/>

</xml_diff>